<commit_message>
Complete Track 02 migration: all docs, pitch guide, docx, package docstrings
</commit_message>
<xml_diff>
--- a/ExamShield.docx
+++ b/ExamShield.docx
@@ -29,7 +29,7 @@
           <w:sz w:val="20"/>
           <w:szCs w:val="20"/>
         </w:rPr>
-        <w:t xml:space="preserve">TRACK 03  //  COMPUTER VISION</w:t>
+        <w:t xml:space="preserve">TRACK 02  //  PREDICTIVE ANALYTICS (ML / DL)</w:t>
       </w:r>
     </w:p>
     <w:p>
@@ -44,7 +44,7 @@
           <w:sz w:val="16"/>
           <w:szCs w:val="16"/>
         </w:rPr>
-        <w:t xml:space="preserve">HACK-THE-MATRIX 2026 (TECHNIDHI) — SNIST</w:t>
+        <w:t xml:space="preserve">AI Handwritten Answer-Sheet Evaluator — HACK-THE-MATRIX 2026 (TECHNIDHI), SNIST</w:t>
       </w:r>
     </w:p>
     <w:p>
@@ -64,7 +64,7 @@
           <w:sz w:val="18"/>
           <w:szCs w:val="18"/>
         </w:rPr>
-        <w:t xml:space="preserve">Universities manually evaluate lakhs of handwritten answer sheets each semester. The process fails in three costly, documented ways:</w:t>
+        <w:t xml:space="preserve">Universities manually evaluate lakhs of handwritten answer scripts each semester. Manual evaluation is slow, inconsistent, and subjective:</w:t>
       </w:r>
     </w:p>
     <w:p>
@@ -82,14 +82,14 @@
           <w:sz w:val="18"/>
           <w:szCs w:val="18"/>
         </w:rPr>
-        <w:t xml:space="preserve">Undetectable copying. </w:t>
-      </w:r>
-      <w:r>
-        <w:rPr>
-          <w:sz w:val="18"/>
-          <w:szCs w:val="18"/>
-        </w:rPr>
-        <w:t xml:space="preserve">Cross-comparing 300 scripts is 44,850 pairwise comparisons — a check no human performs, so collusion coverage is effectively 0%.</w:t>
+        <w:t xml:space="preserve">Inconsistent marking. </w:t>
+      </w:r>
+      <w:r>
+        <w:rPr>
+          <w:sz w:val="18"/>
+          <w:szCs w:val="18"/>
+        </w:rPr>
+        <w:t xml:space="preserve">Different evaluators — and the same evaluator when tired — award different marks for equivalent answers; students pay revaluation fees to correct this.</w:t>
       </w:r>
     </w:p>
     <w:p>
@@ -107,14 +107,14 @@
           <w:sz w:val="18"/>
           <w:szCs w:val="18"/>
         </w:rPr>
-        <w:t xml:space="preserve">Totaling &amp; transcription errors. </w:t>
-      </w:r>
-      <w:r>
-        <w:rPr>
-          <w:sz w:val="18"/>
-          <w:szCs w:val="18"/>
-        </w:rPr>
-        <w:t xml:space="preserve">Tired evaluators add marks wrong or skip answers, forcing students to pay revaluation fees to fix arithmetic slips.</w:t>
+        <w:t xml:space="preserve">Scale. </w:t>
+      </w:r>
+      <w:r>
+        <w:rPr>
+          <w:sz w:val="18"/>
+          <w:szCs w:val="18"/>
+        </w:rPr>
+        <w:t xml:space="preserve">An evaluator grading hundreds of scripts cannot apply the rubric uniformly from sheet #1 to sheet #300.</w:t>
       </w:r>
     </w:p>
     <w:p>
@@ -132,14 +132,14 @@
           <w:sz w:val="18"/>
           <w:szCs w:val="18"/>
         </w:rPr>
-        <w:t xml:space="preserve">Administrative mix-ups. </w:t>
-      </w:r>
-      <w:r>
-        <w:rPr>
-          <w:sz w:val="18"/>
-          <w:szCs w:val="18"/>
-        </w:rPr>
-        <w:t xml:space="preserve">Misread or duplicated roll numbers and borderline totals (39 when pass = 40) flood the system with paid revaluation disputes after publication.</w:t>
+        <w:t xml:space="preserve">No learning from the past. </w:t>
+      </w:r>
+      <w:r>
+        <w:rPr>
+          <w:sz w:val="18"/>
+          <w:szCs w:val="18"/>
+        </w:rPr>
+        <w:t xml:space="preserve">Rubric knowledge lives only in evaluators' heads — nothing captures how teachers actually grade so it can be reused.</w:t>
       </w:r>
     </w:p>
     <w:p>
@@ -168,25 +168,7 @@
           <w:sz w:val="18"/>
           <w:szCs w:val="18"/>
         </w:rPr>
-        <w:t xml:space="preserve"> is an offline CV evaluation engine for answer sheets. Upload a batch of scanned scripts; it finds the copying no human can catch, verifies every total, and highlights grading evidence — in minutes, not weeks. Governing principle: </w:t>
-      </w:r>
-      <w:r>
-        <w:rPr>
-          <w:b/>
-          <w:bCs/>
-          <w:i/>
-          <w:iCs/>
-          <w:sz w:val="18"/>
-          <w:szCs w:val="18"/>
-        </w:rPr>
-        <w:t xml:space="preserve">the system never accuses and never finalizes.</w:t>
-      </w:r>
-      <w:r>
-        <w:rPr>
-          <w:sz w:val="18"/>
-          <w:szCs w:val="18"/>
-        </w:rPr>
-        <w:t xml:space="preserve"> Every output is a ranked flag with image-level evidence for a human to review.</w:t>
+        <w:t xml:space="preserve"> learns how teachers grade from previously corrected answer sheets, then automatically evaluates new scanned scripts — assigning question-wise marks, a total, a percentage, and per-answer feedback. It runs in two phases.</w:t>
       </w:r>
     </w:p>
     <w:p>
@@ -204,14 +186,14 @@
           <w:sz w:val="18"/>
           <w:szCs w:val="18"/>
         </w:rPr>
-        <w:t xml:space="preserve">MarkSafe</w:t>
-      </w:r>
-      <w:r>
-        <w:rPr>
-          <w:sz w:val="18"/>
-          <w:szCs w:val="18"/>
-        </w:rPr>
-        <w:t xml:space="preserve"> — verifies every per-question mark and total; ambiguous regions flagged, never guessed.</w:t>
+        <w:t xml:space="preserve">Phase 1 — Training. </w:t>
+      </w:r>
+      <w:r>
+        <w:rPr>
+          <w:sz w:val="18"/>
+          <w:szCs w:val="18"/>
+        </w:rPr>
+        <w:t xml:space="preserve">Train on historical corrected scripts + teacher-awarded marks + answer keys + rubrics → a mark-predictor model that captures marking behaviour.</w:t>
       </w:r>
     </w:p>
     <w:p>
@@ -229,23 +211,19 @@
           <w:sz w:val="18"/>
           <w:szCs w:val="18"/>
         </w:rPr>
-        <w:t xml:space="preserve">CopyCatch</w:t>
-      </w:r>
-      <w:r>
-        <w:rPr>
-          <w:sz w:val="18"/>
-          <w:szCs w:val="18"/>
-        </w:rPr>
-        <w:t xml:space="preserve"> — cross-compares every pair of scripts and surfaces copying-network clusters with side-by-side image evidence.</w:t>
-      </w:r>
-    </w:p>
-    <w:p>
-      <w:pPr>
-        <w:pStyle w:val="ListParagraph"/>
-        <w:numPr>
-          <w:ilvl w:val="0"/>
-          <w:numId w:val="2"/>
-        </w:numPr>
+        <w:t xml:space="preserve">Phase 2 — Evaluation. </w:t>
+      </w:r>
+      <w:r>
+        <w:rPr>
+          <w:sz w:val="18"/>
+          <w:szCs w:val="18"/>
+        </w:rPr>
+        <w:t xml:space="preserve">OCR a new script → detect each question → measure semantic similarity to the answer key → the trained model assigns percentage-based marks → generate feedback and deduction reasons.</w:t>
+      </w:r>
+    </w:p>
+    <w:p>
+      <w:pPr>
+        <w:spacing w:after="20" w:before="40"/>
       </w:pPr>
       <w:r>
         <w:rPr>
@@ -254,28 +232,7 @@
           <w:sz w:val="18"/>
           <w:szCs w:val="18"/>
         </w:rPr>
-        <w:t xml:space="preserve">ScriptID / ReEval Guard / BlankCheck / RubricLens</w:t>
-      </w:r>
-      <w:r>
-        <w:rPr>
-          <w:sz w:val="18"/>
-          <w:szCs w:val="18"/>
-        </w:rPr>
-        <w:t xml:space="preserve"> — register matching, borderline-total pre-checks, attempt triage, and rubric-evidence highlighting (never auto-grades).</w:t>
-      </w:r>
-    </w:p>
-    <w:p>
-      <w:pPr>
-        <w:spacing w:after="20" w:before="40"/>
-      </w:pPr>
-      <w:r>
-        <w:rPr>
-          <w:b/>
-          <w:bCs/>
-          <w:sz w:val="18"/>
-          <w:szCs w:val="18"/>
-        </w:rPr>
-        <w:t xml:space="preserve">Shared pipeline:  </w:t>
+        <w:t xml:space="preserve">Governing principle:  </w:t>
       </w:r>
       <w:r>
         <w:rPr>
@@ -284,7 +241,7 @@
           <w:sz w:val="18"/>
           <w:szCs w:val="18"/>
         </w:rPr>
-        <w:t xml:space="preserve">Scanned scripts → Preprocess → Zone calibration → OCR branches (digit / prose / ink-presence) → Feature analyses → Ranked flags + evidence → HUMAN DECIDES</w:t>
+        <w:t xml:space="preserve">the mark is produced by the trained model — never by prompting an LLM. Unreadable (low-confidence) answers are flagged for human verification, never guessed.</w:t>
       </w:r>
     </w:p>
     <w:p>
@@ -292,7 +249,7 @@
         <w:pStyle w:val="Heading1"/>
       </w:pPr>
       <w:r>
-        <w:t xml:space="preserve">3.  How It Satisfies Track 03 — All Four Requirements</w:t>
+        <w:t xml:space="preserve">3.  How It Satisfies Track 02 — All Four Requirements</w:t>
       </w:r>
     </w:p>
     <w:tbl>
@@ -308,8 +265,8 @@
         </w:tblBorders>
       </w:tblPr>
       <w:tblGrid>
-        <w:gridCol w:w="3400"/>
-        <w:gridCol w:w="6680"/>
+        <w:gridCol w:w="3600"/>
+        <w:gridCol w:w="6480"/>
       </w:tblGrid>
       <w:tr>
         <w:trPr>
@@ -317,7 +274,7 @@
         </w:trPr>
         <w:tc>
           <w:tcPr>
-            <w:tcW w:type="dxa" w:w="3400"/>
+            <w:tcW w:type="dxa" w:w="3600"/>
             <w:tcBorders>
               <w:top w:val="single" w:color="000000" w:sz="4"/>
               <w:left w:val="single" w:color="000000" w:sz="4"/>
@@ -347,7 +304,7 @@
         </w:tc>
         <w:tc>
           <w:tcPr>
-            <w:tcW w:type="dxa" w:w="6680"/>
+            <w:tcW w:type="dxa" w:w="6480"/>
             <w:tcBorders>
               <w:top w:val="single" w:color="000000" w:sz="4"/>
               <w:left w:val="single" w:color="000000" w:sz="4"/>
@@ -379,7 +336,7 @@
       <w:tr>
         <w:tc>
           <w:tcPr>
-            <w:tcW w:type="dxa" w:w="3400"/>
+            <w:tcW w:type="dxa" w:w="3600"/>
             <w:tcBorders>
               <w:top w:val="single" w:color="000000" w:sz="4"/>
               <w:left w:val="single" w:color="000000" w:sz="4"/>
@@ -401,13 +358,13 @@
                 <w:sz w:val="18"/>
                 <w:szCs w:val="18"/>
               </w:rPr>
-              <w:t xml:space="preserve">Input Stream — image or video processing</w:t>
+              <w:t xml:space="preserve">Dataset — structured data (CSV / SQL / time-series / sensor)</w:t>
             </w:r>
           </w:p>
         </w:tc>
         <w:tc>
           <w:tcPr>
-            <w:tcW w:type="dxa" w:w="6680"/>
+            <w:tcW w:type="dxa" w:w="6480"/>
             <w:tcBorders>
               <w:top w:val="single" w:color="000000" w:sz="4"/>
               <w:left w:val="single" w:color="000000" w:sz="4"/>
@@ -427,7 +384,7 @@
                 <w:sz w:val="18"/>
                 <w:szCs w:val="18"/>
               </w:rPr>
-              <w:t xml:space="preserve">Batches of scanned answer-sheet images/PDFs are ingested and preprocessed with OpenCV (deskew, denoise, adaptive binarization); pypdfium2 rasterizes PDF pages to images.</w:t>
+              <w:t xml:space="preserve">A structured training table: one row per (student answer, answer key, engineered features, teacher-awarded mark) built from previously corrected answer sheets — the teacher's mark is the label.</w:t>
             </w:r>
           </w:p>
         </w:tc>
@@ -435,7 +392,7 @@
       <w:tr>
         <w:tc>
           <w:tcPr>
-            <w:tcW w:type="dxa" w:w="3400"/>
+            <w:tcW w:type="dxa" w:w="3600"/>
             <w:tcBorders>
               <w:top w:val="single" w:color="000000" w:sz="4"/>
               <w:left w:val="single" w:color="000000" w:sz="4"/>
@@ -457,13 +414,13 @@
                 <w:sz w:val="18"/>
                 <w:szCs w:val="18"/>
               </w:rPr>
-              <w:t xml:space="preserve">Vision Pipeline — CNN, YOLO, ResNet, ViT</w:t>
+              <w:t xml:space="preserve">Training Engine — custom model training (Random Forest, XGBoost, Neural Nets, LSTM)</w:t>
             </w:r>
           </w:p>
         </w:tc>
         <w:tc>
           <w:tcPr>
-            <w:tcW w:type="dxa" w:w="6680"/>
+            <w:tcW w:type="dxa" w:w="6480"/>
             <w:tcBorders>
               <w:top w:val="single" w:color="000000" w:sz="4"/>
               <w:left w:val="single" w:color="000000" w:sz="4"/>
@@ -483,7 +440,7 @@
                 <w:sz w:val="18"/>
                 <w:szCs w:val="18"/>
               </w:rPr>
-              <w:t xml:space="preserve">PaddleOCR runs locally as the vision backbone — CNN-based text-detection and text-recognition networks. No cloud, no GPU cluster.</w:t>
+              <w:t xml:space="preserve">A trained XGBoost / RandomForest regressor (the mark-predictor) is fit on the historical data — learning marking behaviour, not hand-written rules.</w:t>
             </w:r>
           </w:p>
         </w:tc>
@@ -491,7 +448,7 @@
       <w:tr>
         <w:tc>
           <w:tcPr>
-            <w:tcW w:type="dxa" w:w="3400"/>
+            <w:tcW w:type="dxa" w:w="3600"/>
             <w:tcBorders>
               <w:top w:val="single" w:color="000000" w:sz="4"/>
               <w:left w:val="single" w:color="000000" w:sz="4"/>
@@ -513,13 +470,13 @@
                 <w:sz w:val="18"/>
                 <w:szCs w:val="18"/>
               </w:rPr>
-              <w:t xml:space="preserve">Automated Understanding — detection, classification, segmentation, or OCR</w:t>
+              <w:t xml:space="preserve">Evaluation — measurable performance (RMSE, R², Accuracy, F1)</w:t>
             </w:r>
           </w:p>
         </w:tc>
         <w:tc>
           <w:tcPr>
-            <w:tcW w:type="dxa" w:w="6680"/>
+            <w:tcW w:type="dxa" w:w="6480"/>
             <w:tcBorders>
               <w:top w:val="single" w:color="000000" w:sz="4"/>
               <w:left w:val="single" w:color="000000" w:sz="4"/>
@@ -539,7 +496,7 @@
                 <w:sz w:val="18"/>
                 <w:szCs w:val="18"/>
               </w:rPr>
-              <w:t xml:space="preserve">Dual-tier OCR: robust digit OCR (marks, totals, roll numbers) and confidence-weighted prose OCR (answer text), plus OpenCV ink-presence detection per answer region.</w:t>
+              <w:t xml:space="preserve">On a held-out split we report RMSE, MAE, R², and accuracy within ±1 mark versus the teachers' marks.</w:t>
             </w:r>
           </w:p>
         </w:tc>
@@ -547,7 +504,7 @@
       <w:tr>
         <w:tc>
           <w:tcPr>
-            <w:tcW w:type="dxa" w:w="3400"/>
+            <w:tcW w:type="dxa" w:w="3600"/>
             <w:tcBorders>
               <w:top w:val="single" w:color="000000" w:sz="4"/>
               <w:left w:val="single" w:color="000000" w:sz="4"/>
@@ -569,13 +526,13 @@
                 <w:sz w:val="18"/>
                 <w:szCs w:val="18"/>
               </w:rPr>
-              <w:t xml:space="preserve">Measurable Output — bounding boxes, labels, masks, or extracted text</w:t>
+              <w:t xml:space="preserve">Output — meaningful predictions</w:t>
             </w:r>
           </w:p>
         </w:tc>
         <w:tc>
           <w:tcPr>
-            <w:tcW w:type="dxa" w:w="6680"/>
+            <w:tcW w:type="dxa" w:w="6480"/>
             <w:tcBorders>
               <w:top w:val="single" w:color="000000" w:sz="4"/>
               <w:left w:val="single" w:color="000000" w:sz="4"/>
@@ -595,7 +552,7 @@
                 <w:sz w:val="18"/>
                 <w:szCs w:val="18"/>
               </w:rPr>
-              <w:t xml:space="preserve">Extracted marks/totals/roll numbers with confidence scores, bounding-box evidence crops for every flag, similarity scores, and anomaly rankings.</w:t>
+              <w:t xml:space="preserve">Predicted question-wise marks, totals, and percentages for new scanned scripts, each with feedback and mark-deduction reasons.</w:t>
             </w:r>
           </w:p>
         </w:tc>
@@ -612,6 +569,27 @@
           <w:sz w:val="18"/>
           <w:szCs w:val="18"/>
         </w:rPr>
+        <w:t xml:space="preserve">Bonus tag: </w:t>
+      </w:r>
+      <w:r>
+        <w:rPr>
+          <w:sz w:val="18"/>
+          <w:szCs w:val="18"/>
+        </w:rPr>
+        <w:t xml:space="preserve">engineered features (semantic similarity, concept coverage, keyword recall, length ratio, negation cues) + hyperparameter tuning and feature-importance reporting.</w:t>
+      </w:r>
+    </w:p>
+    <w:p>
+      <w:pPr>
+        <w:spacing w:before="60"/>
+      </w:pPr>
+      <w:r>
+        <w:rPr>
+          <w:b/>
+          <w:bCs/>
+          <w:sz w:val="18"/>
+          <w:szCs w:val="18"/>
+        </w:rPr>
         <w:t xml:space="preserve">Strictly Prohibited — avoided: </w:t>
       </w:r>
       <w:r>
@@ -619,7 +597,7 @@
           <w:sz w:val="18"/>
           <w:szCs w:val="18"/>
         </w:rPr>
-        <w:t xml:space="preserve">No GPT/LLM anywhere in the pipeline. Only local CV models — PaddleOCR (CNN), MiniLM sentence embeddings, and a small NLI cross-encoder — producing deterministic, explainable output. The banned “upload an image to GPT and display the text answer” pattern is never used.</w:t>
+        <w:t xml:space="preserve">prompting GPT or other LLMs to generate predictions. The mark is always the trained regressor's output; an LLM may only phrase feedback text, never decide a mark. Everything runs locally on CPU.</w:t>
       </w:r>
     </w:p>
     <w:sectPr>

</xml_diff>